<commit_message>
modified:   Webpages/Account.html 	modified:   Webpages/Cart.html 	modified:   Webpages/Home.html 	modified:   Webpages/Products.html 	modified:   Website Project Proposal/Website Project Proposal.docx 	renamed:    CSS/style.css -> styles/style.css 	renamed:    CSS/style2.css -> styles/style2.css 	renamed:    CSS/style3.css -> styles/style3.css
</commit_message>
<xml_diff>
--- a/Website Project Proposal/Website Project Proposal.docx
+++ b/Website Project Proposal/Website Project Proposal.docx
@@ -1165,7 +1165,7 @@
           <w:szCs w:val="22"/>
           <w:lang w:val="en-GB"/>
         </w:rPr>
-        <w:t>Organisation Overview</w:t>
+        <w:t>*This is not a real business</w:t>
       </w:r>
       <w:r>
         <w:rPr>
@@ -1175,24 +1175,38 @@
           <w:szCs w:val="22"/>
           <w:lang w:val="en-GB"/>
         </w:rPr>
-        <w:t>:</w:t>
+        <w:t>. It is a hypothetical business created by me</w:t>
       </w:r>
     </w:p>
     <w:p>
       <w:pPr>
         <w:rPr>
-          <w:sz w:val="22"/>
-          <w:szCs w:val="22"/>
-          <w:lang w:val="en-GB"/>
-        </w:rPr>
-      </w:pPr>
-      <w:r>
-        <w:rPr>
-          <w:sz w:val="22"/>
-          <w:szCs w:val="22"/>
-          <w:lang w:val="en-GB"/>
-        </w:rPr>
-        <w:t>Misunderstood World is a streetwear brand birthed in the streets of Cape Town in the 2000s for people who always felt like outsiders to the world we all live in, founded by two boys from the cape flats with the mission to bring about confidence within those who always felt left out and a strong vision to empower the silent faces of the youth to elevate.</w:t>
+          <w:b/>
+          <w:bCs/>
+          <w:sz w:val="22"/>
+          <w:szCs w:val="22"/>
+          <w:lang w:val="en-GB"/>
+        </w:rPr>
+      </w:pPr>
+      <w:r>
+        <w:rPr>
+          <w:b/>
+          <w:bCs/>
+          <w:sz w:val="22"/>
+          <w:szCs w:val="22"/>
+          <w:lang w:val="en-GB"/>
+        </w:rPr>
+        <w:t>Organisation Overview</w:t>
+      </w:r>
+      <w:r>
+        <w:rPr>
+          <w:b/>
+          <w:bCs/>
+          <w:sz w:val="22"/>
+          <w:szCs w:val="22"/>
+          <w:lang w:val="en-GB"/>
+        </w:rPr>
+        <w:t>:</w:t>
       </w:r>
     </w:p>
     <w:p>
@@ -1203,10 +1217,27 @@
           <w:lang w:val="en-GB"/>
         </w:rPr>
       </w:pPr>
+      <w:r>
+        <w:rPr>
+          <w:sz w:val="22"/>
+          <w:szCs w:val="22"/>
+          <w:lang w:val="en-GB"/>
+        </w:rPr>
+        <w:t>Misunderstood World is a streetwear brand birthed in the streets of Cape Town in the 2000s for people who always felt like outsiders to the world we all live in, founded by two boys from the cape flats with the mission to bring about confidence within those who always felt left out and a strong vision to empower the silent faces of the youth to elevate.</w:t>
+      </w:r>
     </w:p>
     <w:p>
       <w:pPr>
         <w:rPr>
+          <w:sz w:val="22"/>
+          <w:szCs w:val="22"/>
+          <w:lang w:val="en-GB"/>
+        </w:rPr>
+      </w:pPr>
+    </w:p>
+    <w:p>
+      <w:pPr>
+        <w:rPr>
           <w:b/>
           <w:bCs/>
           <w:sz w:val="22"/>
@@ -1239,37 +1270,89 @@
           <w:szCs w:val="22"/>
           <w:lang w:val="en-GB"/>
         </w:rPr>
-        <w:t>The website will be designed with the intention to bring about awareness for street culture and street wear and sell clothing designed for fashionists. Key performance areas entail how social media engagement will be done and how sales will be handled.</w:t>
+        <w:t xml:space="preserve">The website </w:t>
+      </w:r>
+      <w:r>
+        <w:rPr>
+          <w:sz w:val="22"/>
+          <w:szCs w:val="22"/>
+          <w:lang w:val="en-GB"/>
+        </w:rPr>
+        <w:t>for Misunderstood</w:t>
+      </w:r>
+      <w:r>
+        <w:rPr>
+          <w:sz w:val="22"/>
+          <w:szCs w:val="22"/>
+          <w:lang w:val="en-GB"/>
+        </w:rPr>
+        <w:t xml:space="preserve"> World is designed to build a strong digital presence for the streetwear brand while connecting with a youth-driven audience that values individuality, creativity, and self-expression. The main goal of the website is to showcase the brand’s unique identity through visually striking clothing collections, engaging content, and a modern user experience that reflects contemporary street culture. Its objectives include increasing brand awareness, driving online sales, promoting new drops and limited-edition releases, and building a loyal online community through interactive features and social media integration. Key Performance Areas for the website include website traffic growth, customer engagement levels, online sales performance, product page conversion rates, social media referrals, customer satisfaction, and brand visibility. Additional focus areas include maintaining fast website performance, ensuring mobile responsiveness, providing secure online transactions, and delivering consistent visual branding across all pages to strengthen the overall customer experience.</w:t>
       </w:r>
     </w:p>
     <w:p>
       <w:pPr>
         <w:rPr>
-          <w:sz w:val="22"/>
-          <w:szCs w:val="22"/>
-          <w:lang w:val="en-GB"/>
-        </w:rPr>
-      </w:pPr>
+          <w:b/>
+          <w:bCs/>
+          <w:sz w:val="22"/>
+          <w:szCs w:val="22"/>
+          <w:lang w:val="en-GB"/>
+        </w:rPr>
+      </w:pPr>
+      <w:r>
+        <w:rPr>
+          <w:b/>
+          <w:bCs/>
+          <w:sz w:val="22"/>
+          <w:szCs w:val="22"/>
+          <w:lang w:val="en-GB"/>
+        </w:rPr>
+        <w:t>Proposed Website Features and Functionality:</w:t>
+      </w:r>
     </w:p>
     <w:p>
       <w:pPr>
         <w:rPr>
+          <w:sz w:val="22"/>
+          <w:szCs w:val="22"/>
+          <w:lang w:val="en-GB"/>
+        </w:rPr>
+      </w:pPr>
+      <w:r>
+        <w:rPr>
+          <w:sz w:val="22"/>
+          <w:szCs w:val="22"/>
+          <w:lang w:val="en-GB"/>
+        </w:rPr>
+        <w:t>Essential features of the website include a homepage, about us, contact page, products page, with a wish list for items that a user would want to save. Other features include a category list for the different types of clothing pieces and a history page that overlays the whole story behind the brand.</w:t>
+      </w:r>
+    </w:p>
+    <w:p>
+      <w:pPr>
+        <w:rPr>
+          <w:sz w:val="22"/>
+          <w:szCs w:val="22"/>
+          <w:lang w:val="en-GB"/>
+        </w:rPr>
+      </w:pPr>
+    </w:p>
+    <w:p>
+      <w:pPr>
+        <w:rPr>
+          <w:sz w:val="22"/>
+          <w:szCs w:val="22"/>
+          <w:lang w:val="en-GB"/>
+        </w:rPr>
+      </w:pPr>
+      <w:r>
+        <w:rPr>
           <w:b/>
           <w:bCs/>
           <w:sz w:val="22"/>
           <w:szCs w:val="22"/>
           <w:lang w:val="en-GB"/>
         </w:rPr>
-      </w:pPr>
-      <w:r>
-        <w:rPr>
-          <w:b/>
-          <w:bCs/>
-          <w:sz w:val="22"/>
-          <w:szCs w:val="22"/>
-          <w:lang w:val="en-GB"/>
-        </w:rPr>
-        <w:t>Proposed Website Features and Functionality:</w:t>
+        <w:t>Design and User Experience:</w:t>
       </w:r>
     </w:p>
     <w:p>
@@ -1277,96 +1360,15 @@
         <w:rPr>
           <w:sz w:val="22"/>
           <w:szCs w:val="22"/>
-          <w:lang w:val="en-GB"/>
-        </w:rPr>
-      </w:pPr>
-      <w:r>
-        <w:rPr>
-          <w:sz w:val="22"/>
-          <w:szCs w:val="22"/>
-          <w:lang w:val="en-GB"/>
-        </w:rPr>
-        <w:t>Essential features of the website include a homepage, about us, contact page, products page, with a wish list for items that a user would want to save. Other features include a category list for the different types of clothing pieces and a history page that overlays the whole story behind the brand.</w:t>
-      </w:r>
-    </w:p>
-    <w:p>
-      <w:pPr>
-        <w:rPr>
-          <w:sz w:val="22"/>
-          <w:szCs w:val="22"/>
-          <w:lang w:val="en-GB"/>
-        </w:rPr>
-      </w:pPr>
-    </w:p>
-    <w:p>
-      <w:pPr>
-        <w:rPr>
-          <w:sz w:val="22"/>
-          <w:szCs w:val="22"/>
-          <w:lang w:val="en-GB"/>
-        </w:rPr>
-      </w:pPr>
-      <w:r>
-        <w:rPr>
-          <w:b/>
-          <w:bCs/>
-          <w:sz w:val="22"/>
-          <w:szCs w:val="22"/>
-          <w:lang w:val="en-GB"/>
-        </w:rPr>
-        <w:t>Design and User Experience:</w:t>
-      </w:r>
-    </w:p>
-    <w:p>
-      <w:pPr>
-        <w:rPr>
-          <w:sz w:val="22"/>
-          <w:szCs w:val="22"/>
-        </w:rPr>
-      </w:pPr>
-      <w:r>
-        <w:rPr>
-          <w:sz w:val="22"/>
-          <w:szCs w:val="22"/>
-          <w:lang w:val="en-GB"/>
-        </w:rPr>
-        <w:t xml:space="preserve">The overall design aesthetic and branding is a simple street design with a white and blue shades colour scheme involving a typography with font choices such as </w:t>
-      </w:r>
-      <w:proofErr w:type="spellStart"/>
-      <w:r>
-        <w:rPr>
-          <w:sz w:val="22"/>
-          <w:szCs w:val="22"/>
-          <w:lang w:val="en-GB"/>
-        </w:rPr>
-        <w:t>Aerosoldier</w:t>
-      </w:r>
-      <w:proofErr w:type="spellEnd"/>
-      <w:r>
-        <w:rPr>
-          <w:sz w:val="22"/>
-          <w:szCs w:val="22"/>
-          <w:lang w:val="en-GB"/>
-        </w:rPr>
-        <w:t xml:space="preserve"> and </w:t>
-      </w:r>
-      <w:proofErr w:type="spellStart"/>
-      <w:r>
-        <w:rPr>
-          <w:sz w:val="22"/>
-          <w:szCs w:val="22"/>
-          <w:lang w:val="en-GB"/>
-        </w:rPr>
-        <w:t>Funkydori</w:t>
-      </w:r>
-      <w:proofErr w:type="spellEnd"/>
-      <w:r>
-        <w:rPr>
-          <w:sz w:val="22"/>
-          <w:szCs w:val="22"/>
-          <w:lang w:val="en-GB"/>
-        </w:rPr>
-        <w:t xml:space="preserve">/Groovy style. The layout and design will follow the typical useful bait layout with the UX design wireframe that will </w:t>
+        </w:rPr>
+      </w:pPr>
+      <w:r>
+        <w:rPr>
+          <w:sz w:val="22"/>
+          <w:szCs w:val="22"/>
+          <w:lang w:val="en-GB"/>
+        </w:rPr>
+        <w:t xml:space="preserve">The overall design aesthetic and branding is a simple street design with a white and blue shades colour scheme involving a typography with font choices such as Aerosoldier and Funkydori/Groovy style. The layout and design will follow the typical useful bait layout with the UX design wireframe that will </w:t>
       </w:r>
       <w:r>
         <w:rPr>
@@ -1380,7 +1382,15 @@
           <w:sz w:val="22"/>
           <w:szCs w:val="22"/>
         </w:rPr>
-        <w:t>llow exploration of UX concepts without committing to final design details.</w:t>
+        <w:t xml:space="preserve">llow exploration of UX concepts without committing to final </w:t>
+      </w:r>
+      <w:r>
+        <w:rPr>
+          <w:sz w:val="22"/>
+          <w:szCs w:val="22"/>
+        </w:rPr>
+        <w:lastRenderedPageBreak/>
+        <w:t>design details.</w:t>
       </w:r>
       <w:r>
         <w:rPr>
@@ -1454,7 +1464,6 @@
           <w:sz w:val="22"/>
           <w:szCs w:val="22"/>
         </w:rPr>
-        <w:lastRenderedPageBreak/>
         <w:t>Technical Requirements:</w:t>
       </w:r>
     </w:p>
@@ -1694,6 +1703,7 @@
                 <w:szCs w:val="22"/>
                 <w:lang w:val="en-GB"/>
               </w:rPr>
+              <w:lastRenderedPageBreak/>
               <w:t>Market research and Planning</w:t>
             </w:r>
           </w:p>
@@ -2298,7 +2308,6 @@
                 <w:szCs w:val="22"/>
                 <w:lang w:val="en-GB"/>
               </w:rPr>
-              <w:lastRenderedPageBreak/>
               <w:t>Payment gateway integration</w:t>
             </w:r>
           </w:p>
@@ -2965,6 +2974,7 @@
           <w:szCs w:val="22"/>
           <w:lang w:val="en-GB"/>
         </w:rPr>
+        <w:lastRenderedPageBreak/>
         <w:drawing>
           <wp:inline distT="0" distB="0" distL="0" distR="0" wp14:anchorId="3E17FD62" wp14:editId="54191F05">
             <wp:extent cx="5731510" cy="3223895"/>
@@ -3830,7 +3840,7 @@
           <w:szCs w:val="22"/>
         </w:rPr>
         <w:drawing>
-          <wp:inline distT="0" distB="0" distL="0" distR="0" wp14:anchorId="448CDA44" wp14:editId="2A21B67D">
+          <wp:inline distT="0" distB="0" distL="0" distR="0" wp14:anchorId="448CDA44" wp14:editId="45EE15BC">
             <wp:extent cx="5786759" cy="3857625"/>
             <wp:effectExtent l="0" t="0" r="4445" b="0"/>
             <wp:docPr id="25116695" name="Picture 1"/>

</xml_diff>

<commit_message>
Changes to be committed: 	new file:   Webpages/Location.html 	new file:   Webpages/script.js 	deleted:    Webpages/style.css 	modified:   Webpages/style2.css 	deleted:    Webpages/style3.css 	modified:   Website Project Proposal/Website Project Proposal.docx 	deleted:    Website Project Proposal/Website Project Proposal.pdf
</commit_message>
<xml_diff>
--- a/Website Project Proposal/Website Project Proposal.docx
+++ b/Website Project Proposal/Website Project Proposal.docx
@@ -161,7 +161,6 @@
                                     <w:dataBinding w:prefixMappings="xmlns:ns0='http://purl.org/dc/elements/1.1/' xmlns:ns1='http://schemas.openxmlformats.org/package/2006/metadata/core-properties' " w:xpath="/ns1:coreProperties[1]/ns0:subject[1]" w:storeItemID="{6C3C8BC8-F283-45AE-878A-BAB7291924A1}"/>
                                     <w:text/>
                                   </w:sdtPr>
-                                  <w:sdtEndPr/>
                                   <w:sdtContent>
                                     <w:r>
                                       <w:rPr>
@@ -915,7 +914,6 @@
                                     <w:dataBinding w:prefixMappings="xmlns:ns0='http://schemas.openxmlformats.org/officeDocument/2006/extended-properties' " w:xpath="/ns0:Properties[1]/ns0:Company[1]" w:storeItemID="{6668398D-A668-4E3E-A5EB-62B293D839F1}"/>
                                     <w:text/>
                                   </w:sdtPr>
-                                  <w:sdtEndPr/>
                                   <w:sdtContent>
                                     <w:r>
                                       <w:rPr>
@@ -941,7 +939,6 @@
                                   <w:dataBinding w:prefixMappings="xmlns:ns0='http://purl.org/dc/elements/1.1/' xmlns:ns1='http://schemas.openxmlformats.org/package/2006/metadata/core-properties' " w:xpath="/ns1:coreProperties[1]/ns1:category[1]" w:storeItemID="{6C3C8BC8-F283-45AE-878A-BAB7291924A1}"/>
                                   <w:text/>
                                 </w:sdtPr>
-                                <w:sdtEndPr/>
                                 <w:sdtContent>
                                   <w:p>
                                     <w:pPr>
@@ -1270,23 +1267,7 @@
           <w:szCs w:val="22"/>
           <w:lang w:val="en-GB"/>
         </w:rPr>
-        <w:t xml:space="preserve">The website </w:t>
-      </w:r>
-      <w:r>
-        <w:rPr>
-          <w:sz w:val="22"/>
-          <w:szCs w:val="22"/>
-          <w:lang w:val="en-GB"/>
-        </w:rPr>
-        <w:t>for Misunderstood</w:t>
-      </w:r>
-      <w:r>
-        <w:rPr>
-          <w:sz w:val="22"/>
-          <w:szCs w:val="22"/>
-          <w:lang w:val="en-GB"/>
-        </w:rPr>
-        <w:t xml:space="preserve"> World is designed to build a strong digital presence for the streetwear brand while connecting with a youth-driven audience that values individuality, creativity, and self-expression. The main goal of the website is to showcase the brand’s unique identity through visually striking clothing collections, engaging content, and a modern user experience that reflects contemporary street culture. Its objectives include increasing brand awareness, driving online sales, promoting new drops and limited-edition releases, and building a loyal online community through interactive features and social media integration. Key Performance Areas for the website include website traffic growth, customer engagement levels, online sales performance, product page conversion rates, social media referrals, customer satisfaction, and brand visibility. Additional focus areas include maintaining fast website performance, ensuring mobile responsiveness, providing secure online transactions, and delivering consistent visual branding across all pages to strengthen the overall customer experience.</w:t>
+        <w:t>The website for Misunderstood World is designed to build a strong digital presence for the streetwear brand while connecting with a youth-driven audience that values individuality, creativity, and self-expression. The main goal of the website is to showcase the brand’s unique identity through visually striking clothing collections, engaging content, and a modern user experience that reflects contemporary street culture. Its objectives include increasing brand awareness, driving online sales, promoting new drops and limited-edition releases, and building a loyal online community through interactive features and social media integration. Key Performance Areas for the website include website traffic growth, customer engagement levels, online sales performance, product page conversion rates, social media referrals, customer satisfaction, and brand visibility. Additional focus areas include maintaining fast website performance, ensuring mobile responsiveness, providing secure online transactions, and delivering consistent visual branding across all pages to strengthen the overall customer experience.</w:t>
       </w:r>
     </w:p>
     <w:p>
@@ -1451,6 +1432,155 @@
     <w:p>
       <w:pPr>
         <w:rPr>
+          <w:sz w:val="22"/>
+          <w:szCs w:val="22"/>
+        </w:rPr>
+      </w:pPr>
+      <w:r>
+        <w:rPr>
+          <w:sz w:val="22"/>
+          <w:szCs w:val="22"/>
+        </w:rPr>
+        <w:t>The following image is a representation of the colours to be used on the website:</w:t>
+      </w:r>
+    </w:p>
+    <w:p>
+      <w:pPr>
+        <w:rPr>
+          <w:sz w:val="22"/>
+          <w:szCs w:val="22"/>
+        </w:rPr>
+      </w:pPr>
+      <w:r>
+        <w:rPr>
+          <w:noProof/>
+          <w:sz w:val="22"/>
+          <w:szCs w:val="22"/>
+        </w:rPr>
+        <w:drawing>
+          <wp:inline distT="0" distB="0" distL="0" distR="0" wp14:anchorId="00D07EBA" wp14:editId="42C43F26">
+            <wp:extent cx="5731510" cy="4298950"/>
+            <wp:effectExtent l="0" t="0" r="2540" b="6350"/>
+            <wp:docPr id="1546235850" name="Picture 8"/>
+            <wp:cNvGraphicFramePr>
+              <a:graphicFrameLocks xmlns:a="http://schemas.openxmlformats.org/drawingml/2006/main" noChangeAspect="1"/>
+            </wp:cNvGraphicFramePr>
+            <a:graphic xmlns:a="http://schemas.openxmlformats.org/drawingml/2006/main">
+              <a:graphicData uri="http://schemas.openxmlformats.org/drawingml/2006/picture">
+                <pic:pic xmlns:pic="http://schemas.openxmlformats.org/drawingml/2006/picture">
+                  <pic:nvPicPr>
+                    <pic:cNvPr id="1546235850" name="Picture 1546235850"/>
+                    <pic:cNvPicPr/>
+                  </pic:nvPicPr>
+                  <pic:blipFill>
+                    <a:blip r:embed="rId6" cstate="print">
+                      <a:extLst>
+                        <a:ext uri="{28A0092B-C50C-407E-A947-70E740481C1C}">
+                          <a14:useLocalDpi xmlns:a14="http://schemas.microsoft.com/office/drawing/2010/main" val="0"/>
+                        </a:ext>
+                      </a:extLst>
+                    </a:blip>
+                    <a:stretch>
+                      <a:fillRect/>
+                    </a:stretch>
+                  </pic:blipFill>
+                  <pic:spPr>
+                    <a:xfrm>
+                      <a:off x="0" y="0"/>
+                      <a:ext cx="5731510" cy="4298950"/>
+                    </a:xfrm>
+                    <a:prstGeom prst="rect">
+                      <a:avLst/>
+                    </a:prstGeom>
+                  </pic:spPr>
+                </pic:pic>
+              </a:graphicData>
+            </a:graphic>
+          </wp:inline>
+        </w:drawing>
+      </w:r>
+    </w:p>
+    <w:p>
+      <w:pPr>
+        <w:rPr>
+          <w:sz w:val="22"/>
+          <w:szCs w:val="22"/>
+        </w:rPr>
+      </w:pPr>
+      <w:r>
+        <w:rPr>
+          <w:sz w:val="22"/>
+          <w:szCs w:val="22"/>
+        </w:rPr>
+        <w:t>The following image is</w:t>
+      </w:r>
+      <w:r>
+        <w:rPr>
+          <w:sz w:val="22"/>
+          <w:szCs w:val="22"/>
+        </w:rPr>
+        <w:t xml:space="preserve"> the type of font that will be used in website to bring life to it:</w:t>
+      </w:r>
+    </w:p>
+    <w:p>
+      <w:pPr>
+        <w:rPr>
+          <w:sz w:val="22"/>
+          <w:szCs w:val="22"/>
+        </w:rPr>
+      </w:pPr>
+      <w:r>
+        <w:rPr>
+          <w:noProof/>
+          <w:sz w:val="22"/>
+          <w:szCs w:val="22"/>
+        </w:rPr>
+        <w:drawing>
+          <wp:inline distT="0" distB="0" distL="0" distR="0" wp14:anchorId="67305387" wp14:editId="338866A3">
+            <wp:extent cx="5297107" cy="1079746"/>
+            <wp:effectExtent l="0" t="0" r="0" b="6350"/>
+            <wp:docPr id="72798501" name="Picture 9"/>
+            <wp:cNvGraphicFramePr>
+              <a:graphicFrameLocks xmlns:a="http://schemas.openxmlformats.org/drawingml/2006/main" noChangeAspect="1"/>
+            </wp:cNvGraphicFramePr>
+            <a:graphic xmlns:a="http://schemas.openxmlformats.org/drawingml/2006/main">
+              <a:graphicData uri="http://schemas.openxmlformats.org/drawingml/2006/picture">
+                <pic:pic xmlns:pic="http://schemas.openxmlformats.org/drawingml/2006/picture">
+                  <pic:nvPicPr>
+                    <pic:cNvPr id="72798501" name="Picture 72798501"/>
+                    <pic:cNvPicPr/>
+                  </pic:nvPicPr>
+                  <pic:blipFill>
+                    <a:blip r:embed="rId7">
+                      <a:extLst>
+                        <a:ext uri="{28A0092B-C50C-407E-A947-70E740481C1C}">
+                          <a14:useLocalDpi xmlns:a14="http://schemas.microsoft.com/office/drawing/2010/main" val="0"/>
+                        </a:ext>
+                      </a:extLst>
+                    </a:blip>
+                    <a:stretch>
+                      <a:fillRect/>
+                    </a:stretch>
+                  </pic:blipFill>
+                  <pic:spPr>
+                    <a:xfrm>
+                      <a:off x="0" y="0"/>
+                      <a:ext cx="5297107" cy="1079746"/>
+                    </a:xfrm>
+                    <a:prstGeom prst="rect">
+                      <a:avLst/>
+                    </a:prstGeom>
+                  </pic:spPr>
+                </pic:pic>
+              </a:graphicData>
+            </a:graphic>
+          </wp:inline>
+        </w:drawing>
+      </w:r>
+    </w:p>
+    <w:p>
+      <w:pPr>
+        <w:rPr>
           <w:b/>
           <w:bCs/>
           <w:sz w:val="22"/>
@@ -1464,6 +1594,7 @@
           <w:sz w:val="22"/>
           <w:szCs w:val="22"/>
         </w:rPr>
+        <w:lastRenderedPageBreak/>
         <w:t>Technical Requirements:</w:t>
       </w:r>
     </w:p>
@@ -1479,7 +1610,182 @@
           <w:sz w:val="22"/>
           <w:szCs w:val="22"/>
         </w:rPr>
-        <w:t>Technical Requirements will include the use of languages such as HTML, JavaScript and CSS. Websites and tools such as vercel.com and GitHub will be used to deploy our website to the internet. cPanel will be used to host our final website. A domain name will be purchased and run through on GoDaddy.com.</w:t>
+        <w:t>Infrastructure and Hosting</w:t>
+      </w:r>
+    </w:p>
+    <w:p>
+      <w:pPr>
+        <w:rPr>
+          <w:sz w:val="22"/>
+          <w:szCs w:val="22"/>
+        </w:rPr>
+      </w:pPr>
+      <w:r>
+        <w:rPr>
+          <w:sz w:val="22"/>
+          <w:szCs w:val="22"/>
+        </w:rPr>
+        <w:t>The Misunderstood World website will be hosted on a reliable cloud-based hosting platform to ensure high availability, scalability, and fast loading speeds. The hosting infrastructure will support increased traffic during product launches and promotional campaigns. The website will use a Content Delivery Network (CDN) to distribute content efficiently to users across different locations, while regular backups and disaster recovery measures will ensure business continuity and data protection.</w:t>
+      </w:r>
+    </w:p>
+    <w:p>
+      <w:pPr>
+        <w:rPr>
+          <w:sz w:val="22"/>
+          <w:szCs w:val="22"/>
+        </w:rPr>
+      </w:pPr>
+    </w:p>
+    <w:p>
+      <w:pPr>
+        <w:rPr>
+          <w:sz w:val="22"/>
+          <w:szCs w:val="22"/>
+        </w:rPr>
+      </w:pPr>
+      <w:r>
+        <w:rPr>
+          <w:sz w:val="22"/>
+          <w:szCs w:val="22"/>
+        </w:rPr>
+        <w:t>Performance and Accessibility</w:t>
+      </w:r>
+    </w:p>
+    <w:p>
+      <w:pPr>
+        <w:rPr>
+          <w:sz w:val="22"/>
+          <w:szCs w:val="22"/>
+        </w:rPr>
+      </w:pPr>
+      <w:r>
+        <w:rPr>
+          <w:sz w:val="22"/>
+          <w:szCs w:val="22"/>
+        </w:rPr>
+        <w:t>The website will be optimized to provide a fast and responsive user experience across desktops, tablets, and mobile devices. Images and media files will be compressed to reduce loading times, and the site will be designed with responsive layouts to adapt to different screen sizes. Accessibility standards will be incorporated to ensure that users with disabilities can navigate and interact with the website through features such as alternative text for images, readable typography, keyboard navigation support, and sufficient colour contrast.</w:t>
+      </w:r>
+    </w:p>
+    <w:p>
+      <w:pPr>
+        <w:rPr>
+          <w:sz w:val="22"/>
+          <w:szCs w:val="22"/>
+        </w:rPr>
+      </w:pPr>
+    </w:p>
+    <w:p>
+      <w:pPr>
+        <w:rPr>
+          <w:sz w:val="22"/>
+          <w:szCs w:val="22"/>
+        </w:rPr>
+      </w:pPr>
+      <w:r>
+        <w:rPr>
+          <w:sz w:val="22"/>
+          <w:szCs w:val="22"/>
+        </w:rPr>
+        <w:t>Security and Compliance</w:t>
+      </w:r>
+    </w:p>
+    <w:p>
+      <w:pPr>
+        <w:rPr>
+          <w:sz w:val="22"/>
+          <w:szCs w:val="22"/>
+        </w:rPr>
+      </w:pPr>
+      <w:r>
+        <w:rPr>
+          <w:sz w:val="22"/>
+          <w:szCs w:val="22"/>
+        </w:rPr>
+        <w:t>Security measures will be implemented to protect customer information and online transactions. The website will use SSL/TLS encryption to secure data transmitted between users and the server. User accounts and payment information will be protected through secure authentication processes and trusted payment gateways. The website will comply with relevant data protection regulations, including the Protection of Personal Information Act (POPIA), ensuring that customer data is collected, stored, and processed responsibly and transparently.</w:t>
+      </w:r>
+    </w:p>
+    <w:p>
+      <w:pPr>
+        <w:rPr>
+          <w:sz w:val="22"/>
+          <w:szCs w:val="22"/>
+        </w:rPr>
+      </w:pPr>
+    </w:p>
+    <w:p>
+      <w:pPr>
+        <w:rPr>
+          <w:sz w:val="22"/>
+          <w:szCs w:val="22"/>
+        </w:rPr>
+      </w:pPr>
+      <w:r>
+        <w:rPr>
+          <w:sz w:val="22"/>
+          <w:szCs w:val="22"/>
+        </w:rPr>
+        <w:t>Functional Interfaces</w:t>
+      </w:r>
+    </w:p>
+    <w:p>
+      <w:pPr>
+        <w:rPr>
+          <w:sz w:val="22"/>
+          <w:szCs w:val="22"/>
+        </w:rPr>
+      </w:pPr>
+      <w:r>
+        <w:rPr>
+          <w:sz w:val="22"/>
+          <w:szCs w:val="22"/>
+        </w:rPr>
+        <w:t>The website will feature intuitive interfaces that allow users to browse products, search for specific items, view detailed product information, and complete purchases efficiently. Functional interfaces will include product catalogues, shopping carts, user account management, secure checkout systems, contact forms, and social media integration. An administrative dashboard will enable staff to manage products, inventory, orders, customer information, and website content effectively.</w:t>
+      </w:r>
+    </w:p>
+    <w:p>
+      <w:pPr>
+        <w:rPr>
+          <w:sz w:val="22"/>
+          <w:szCs w:val="22"/>
+        </w:rPr>
+      </w:pPr>
+    </w:p>
+    <w:p>
+      <w:pPr>
+        <w:rPr>
+          <w:sz w:val="22"/>
+          <w:szCs w:val="22"/>
+        </w:rPr>
+      </w:pPr>
+      <w:r>
+        <w:rPr>
+          <w:sz w:val="22"/>
+          <w:szCs w:val="22"/>
+        </w:rPr>
+        <w:t>Ongoing Maintenance</w:t>
+      </w:r>
+    </w:p>
+    <w:p>
+      <w:pPr>
+        <w:rPr>
+          <w:sz w:val="22"/>
+          <w:szCs w:val="22"/>
+        </w:rPr>
+      </w:pPr>
+      <w:r>
+        <w:rPr>
+          <w:sz w:val="22"/>
+          <w:szCs w:val="22"/>
+        </w:rPr>
+        <w:t xml:space="preserve">Regular maintenance will be conducted to ensure the website remains secure, functional, and up to date. This includes updating software, plugins, and security patches, monitoring website performance, fixing bugs, and backing up data regularly. Product information, promotional </w:t>
+      </w:r>
+      <w:r>
+        <w:rPr>
+          <w:sz w:val="22"/>
+          <w:szCs w:val="22"/>
+        </w:rPr>
+        <w:lastRenderedPageBreak/>
+        <w:t>content, and branding elements will be updated as needed to keep the website relevant and engaging. Ongoing maintenance will also involve analysing website analytics and customer feedback to identify opportunities for improvement and enhance the overall user experience.</w:t>
       </w:r>
     </w:p>
     <w:p>
@@ -1542,7 +1848,7 @@
                     <pic:cNvPicPr/>
                   </pic:nvPicPr>
                   <pic:blipFill>
-                    <a:blip r:embed="rId6" cstate="print">
+                    <a:blip r:embed="rId8" cstate="print">
                       <a:extLst>
                         <a:ext uri="{28A0092B-C50C-407E-A947-70E740481C1C}">
                           <a14:useLocalDpi xmlns:a14="http://schemas.microsoft.com/office/drawing/2010/main" val="0"/>
@@ -1703,7 +2009,6 @@
                 <w:szCs w:val="22"/>
                 <w:lang w:val="en-GB"/>
               </w:rPr>
-              <w:lastRenderedPageBreak/>
               <w:t>Market research and Planning</w:t>
             </w:r>
           </w:p>
@@ -2974,7 +3279,6 @@
           <w:szCs w:val="22"/>
           <w:lang w:val="en-GB"/>
         </w:rPr>
-        <w:lastRenderedPageBreak/>
         <w:drawing>
           <wp:inline distT="0" distB="0" distL="0" distR="0" wp14:anchorId="3E17FD62" wp14:editId="54191F05">
             <wp:extent cx="5731510" cy="3223895"/>
@@ -2991,7 +3295,7 @@
                     <pic:cNvPicPr/>
                   </pic:nvPicPr>
                   <pic:blipFill>
-                    <a:blip r:embed="rId7" cstate="print">
+                    <a:blip r:embed="rId9" cstate="print">
                       <a:extLst>
                         <a:ext uri="{28A0092B-C50C-407E-A947-70E740481C1C}">
                           <a14:useLocalDpi xmlns:a14="http://schemas.microsoft.com/office/drawing/2010/main" val="0"/>
@@ -3840,7 +4144,7 @@
           <w:szCs w:val="22"/>
         </w:rPr>
         <w:drawing>
-          <wp:inline distT="0" distB="0" distL="0" distR="0" wp14:anchorId="448CDA44" wp14:editId="45EE15BC">
+          <wp:inline distT="0" distB="0" distL="0" distR="0" wp14:anchorId="448CDA44" wp14:editId="221961A8">
             <wp:extent cx="5786759" cy="3857625"/>
             <wp:effectExtent l="0" t="0" r="4445" b="0"/>
             <wp:docPr id="25116695" name="Picture 1"/>
@@ -3855,7 +4159,7 @@
                     <pic:cNvPicPr/>
                   </pic:nvPicPr>
                   <pic:blipFill>
-                    <a:blip r:embed="rId8" cstate="print">
+                    <a:blip r:embed="rId10" cstate="print">
                       <a:extLst>
                         <a:ext uri="{28A0092B-C50C-407E-A947-70E740481C1C}">
                           <a14:useLocalDpi xmlns:a14="http://schemas.microsoft.com/office/drawing/2010/main" val="0"/>
@@ -4150,7 +4454,7 @@
                     <pic:cNvPicPr/>
                   </pic:nvPicPr>
                   <pic:blipFill>
-                    <a:blip r:embed="rId6" cstate="print">
+                    <a:blip r:embed="rId8" cstate="print">
                       <a:extLst>
                         <a:ext uri="{28A0092B-C50C-407E-A947-70E740481C1C}">
                           <a14:useLocalDpi xmlns:a14="http://schemas.microsoft.com/office/drawing/2010/main" val="0"/>
@@ -6209,7 +6513,7 @@
                     <pic:cNvPicPr/>
                   </pic:nvPicPr>
                   <pic:blipFill>
-                    <a:blip r:embed="rId9" cstate="print">
+                    <a:blip r:embed="rId11" cstate="print">
                       <a:extLst>
                         <a:ext uri="{28A0092B-C50C-407E-A947-70E740481C1C}">
                           <a14:useLocalDpi xmlns:a14="http://schemas.microsoft.com/office/drawing/2010/main" val="0"/>

</xml_diff>